<commit_message>
docs: e-mailben elkuldtem Pach Szilvinek es a Penzugynek a csatolasi dokumentaciot.
</commit_message>
<xml_diff>
--- a/docs/Scala/Számlaképfájlok csatolása - felhasználóknak.docx
+++ b/docs/Scala/Számlaképfájlok csatolása - felhasználóknak.docx
@@ -40,12 +40,76 @@
         </w:rPr>
         <w:t>készítette: Szőke László – Mega-Logistic Zrt., 2026. május 22. 16.04</w:t>
       </w:r>
-    </w:p>
-    <w:bookmarkStart w:id="0" w:name="_Toc230364356" w:displacedByCustomXml="next"/>
-    <w:bookmarkStart w:id="1" w:name="_Toc230364301" w:displacedByCustomXml="next"/>
+      <w:r>
+        <w:rPr>
+          <w:sz w:val="18"/>
+          <w:szCs w:val="18"/>
+        </w:rPr>
+        <w:t>, f</w:t>
+      </w:r>
+      <w:r>
+        <w:rPr>
+          <w:sz w:val="18"/>
+          <w:szCs w:val="18"/>
+        </w:rPr>
+        <w:t xml:space="preserve">rissítve: </w:t>
+      </w:r>
+      <w:r>
+        <w:rPr>
+          <w:sz w:val="18"/>
+          <w:szCs w:val="18"/>
+        </w:rPr>
+        <w:t>2026. május 2</w:t>
+      </w:r>
+      <w:r>
+        <w:rPr>
+          <w:sz w:val="18"/>
+          <w:szCs w:val="18"/>
+        </w:rPr>
+        <w:t>6</w:t>
+      </w:r>
+      <w:r>
+        <w:rPr>
+          <w:sz w:val="18"/>
+          <w:szCs w:val="18"/>
+        </w:rPr>
+        <w:t>. 1</w:t>
+      </w:r>
+      <w:r>
+        <w:rPr>
+          <w:sz w:val="18"/>
+          <w:szCs w:val="18"/>
+        </w:rPr>
+        <w:t>0</w:t>
+      </w:r>
+      <w:r>
+        <w:rPr>
+          <w:sz w:val="18"/>
+          <w:szCs w:val="18"/>
+        </w:rPr>
+        <w:t>.</w:t>
+      </w:r>
+      <w:r>
+        <w:rPr>
+          <w:sz w:val="18"/>
+          <w:szCs w:val="18"/>
+        </w:rPr>
+        <w:t>32</w:t>
+      </w:r>
+    </w:p>
+    <w:bookmarkStart w:id="0" w:name="_Toc230364301" w:displacedByCustomXml="next"/>
+    <w:bookmarkStart w:id="1" w:name="_Toc230364356" w:displacedByCustomXml="next"/>
     <w:bookmarkStart w:id="2" w:name="_Toc230353463" w:displacedByCustomXml="next"/>
     <w:sdt>
       <w:sdtPr>
+        <w:rPr>
+          <w:rFonts w:asciiTheme="minorHAnsi" w:eastAsiaTheme="minorHAnsi" w:hAnsiTheme="minorHAnsi" w:cstheme="minorBidi"/>
+          <w:color w:val="auto"/>
+          <w:sz w:val="22"/>
+          <w:szCs w:val="22"/>
+          <w:lang w:eastAsia="en-US"/>
+          <w14:ligatures w14:val="standardContextual"/>
+        </w:rPr>
         <w:id w:val="1502078023"/>
         <w:docPartObj>
           <w:docPartGallery w:val="Table of Contents"/>
@@ -54,14 +118,8 @@
       </w:sdtPr>
       <w:sdtEndPr>
         <w:rPr>
-          <w:rFonts w:asciiTheme="minorHAnsi" w:eastAsiaTheme="minorHAnsi" w:hAnsiTheme="minorHAnsi" w:cstheme="minorBidi"/>
           <w:b/>
           <w:bCs/>
-          <w:color w:val="auto"/>
-          <w:sz w:val="22"/>
-          <w:szCs w:val="22"/>
-          <w:lang w:eastAsia="en-US"/>
-          <w14:ligatures w14:val="standardContextual"/>
         </w:rPr>
       </w:sdtEndPr>
       <w:sdtContent>
@@ -97,13 +155,13 @@
           <w:r>
             <w:fldChar w:fldCharType="separate"/>
           </w:r>
-          <w:hyperlink w:anchor="_Toc230364836" w:history="1">
+          <w:hyperlink w:anchor="_Toc230683904" w:history="1">
             <w:r>
               <w:rPr>
                 <w:rStyle w:val="Hyperlink"/>
                 <w:noProof/>
               </w:rPr>
-              <w:t>Gyors mappaáttekintő</w:t>
+              <w:t>1. Gyors mappaáttekintő</w:t>
             </w:r>
             <w:r>
               <w:rPr>
@@ -124,7 +182,7 @@
                 <w:noProof/>
                 <w:webHidden/>
               </w:rPr>
-              <w:instrText xml:space="preserve"> PAGEREF _Toc230364836 \h </w:instrText>
+              <w:instrText xml:space="preserve"> PAGEREF _Toc230683904 \h </w:instrText>
             </w:r>
             <w:r>
               <w:rPr>
@@ -170,13 +228,13 @@
               <w:lang w:eastAsia="hu-HU"/>
             </w:rPr>
           </w:pPr>
-          <w:hyperlink w:anchor="_Toc230364837" w:history="1">
+          <w:hyperlink w:anchor="_Toc230683905" w:history="1">
             <w:r>
               <w:rPr>
                 <w:rStyle w:val="Hyperlink"/>
                 <w:noProof/>
               </w:rPr>
-              <w:t>Bejövő számlák érkezése</w:t>
+              <w:t>2. Bejövő számlák érkezése</w:t>
             </w:r>
             <w:r>
               <w:rPr>
@@ -197,7 +255,7 @@
                 <w:noProof/>
                 <w:webHidden/>
               </w:rPr>
-              <w:instrText xml:space="preserve"> PAGEREF _Toc230364837 \h </w:instrText>
+              <w:instrText xml:space="preserve"> PAGEREF _Toc230683905 \h </w:instrText>
             </w:r>
             <w:r>
               <w:rPr>
@@ -243,13 +301,13 @@
               <w:lang w:eastAsia="hu-HU"/>
             </w:rPr>
           </w:pPr>
-          <w:hyperlink w:anchor="_Toc230364838" w:history="1">
+          <w:hyperlink w:anchor="_Toc230683906" w:history="1">
             <w:r>
               <w:rPr>
                 <w:rStyle w:val="Hyperlink"/>
                 <w:noProof/>
               </w:rPr>
-              <w:t>E-mailben PDF-fájlként csatolva</w:t>
+              <w:t>2.1. E-mailben PDF-fájlként csatolva</w:t>
             </w:r>
             <w:r>
               <w:rPr>
@@ -270,7 +328,7 @@
                 <w:noProof/>
                 <w:webHidden/>
               </w:rPr>
-              <w:instrText xml:space="preserve"> PAGEREF _Toc230364838 \h </w:instrText>
+              <w:instrText xml:space="preserve"> PAGEREF _Toc230683906 \h </w:instrText>
             </w:r>
             <w:r>
               <w:rPr>
@@ -290,7 +348,7 @@
                 <w:noProof/>
                 <w:webHidden/>
               </w:rPr>
-              <w:t>1</w:t>
+              <w:t>2</w:t>
             </w:r>
             <w:r>
               <w:rPr>
@@ -316,13 +374,13 @@
               <w:lang w:eastAsia="hu-HU"/>
             </w:rPr>
           </w:pPr>
-          <w:hyperlink w:anchor="_Toc230364839" w:history="1">
+          <w:hyperlink w:anchor="_Toc230683907" w:history="1">
             <w:r>
               <w:rPr>
                 <w:rStyle w:val="Hyperlink"/>
                 <w:noProof/>
               </w:rPr>
-              <w:t>E-mailben link a letöltési helyre hivatkozva</w:t>
+              <w:t>2.2. E-mailben csak letöltési link van</w:t>
             </w:r>
             <w:r>
               <w:rPr>
@@ -343,7 +401,7 @@
                 <w:noProof/>
                 <w:webHidden/>
               </w:rPr>
-              <w:instrText xml:space="preserve"> PAGEREF _Toc230364839 \h </w:instrText>
+              <w:instrText xml:space="preserve"> PAGEREF _Toc230683907 \h </w:instrText>
             </w:r>
             <w:r>
               <w:rPr>
@@ -363,7 +421,7 @@
                 <w:noProof/>
                 <w:webHidden/>
               </w:rPr>
-              <w:t>1</w:t>
+              <w:t>2</w:t>
             </w:r>
             <w:r>
               <w:rPr>
@@ -389,13 +447,13 @@
               <w:lang w:eastAsia="hu-HU"/>
             </w:rPr>
           </w:pPr>
-          <w:hyperlink w:anchor="_Toc230364840" w:history="1">
+          <w:hyperlink w:anchor="_Toc230683908" w:history="1">
             <w:r>
               <w:rPr>
                 <w:rStyle w:val="Hyperlink"/>
                 <w:noProof/>
               </w:rPr>
-              <w:t>Postai úton papír alapon</w:t>
+              <w:t>2.3. A számla papíron, postán érkezik</w:t>
             </w:r>
             <w:r>
               <w:rPr>
@@ -416,7 +474,7 @@
                 <w:noProof/>
                 <w:webHidden/>
               </w:rPr>
-              <w:instrText xml:space="preserve"> PAGEREF _Toc230364840 \h </w:instrText>
+              <w:instrText xml:space="preserve"> PAGEREF _Toc230683908 \h </w:instrText>
             </w:r>
             <w:r>
               <w:rPr>
@@ -462,13 +520,13 @@
               <w:lang w:eastAsia="hu-HU"/>
             </w:rPr>
           </w:pPr>
-          <w:hyperlink w:anchor="_Toc230364841" w:history="1">
+          <w:hyperlink w:anchor="_Toc230683909" w:history="1">
             <w:r>
               <w:rPr>
                 <w:rStyle w:val="Hyperlink"/>
                 <w:noProof/>
               </w:rPr>
-              <w:t>Automatikus PDF-átnevezés</w:t>
+              <w:t>3. Mit csinál az ivren automatikusan</w:t>
             </w:r>
             <w:r>
               <w:rPr>
@@ -489,7 +547,7 @@
                 <w:noProof/>
                 <w:webHidden/>
               </w:rPr>
-              <w:instrText xml:space="preserve"> PAGEREF _Toc230364841 \h </w:instrText>
+              <w:instrText xml:space="preserve"> PAGEREF _Toc230683909 \h </w:instrText>
             </w:r>
             <w:r>
               <w:rPr>
@@ -535,13 +593,13 @@
               <w:lang w:eastAsia="hu-HU"/>
             </w:rPr>
           </w:pPr>
-          <w:hyperlink w:anchor="_Toc230364842" w:history="1">
+          <w:hyperlink w:anchor="_Toc230683910" w:history="1">
             <w:r>
               <w:rPr>
                 <w:rStyle w:val="Hyperlink"/>
                 <w:noProof/>
               </w:rPr>
-              <w:t>iScala program automatikusan csatol</w:t>
+              <w:t>4. Mit csinál az iScala?</w:t>
             </w:r>
             <w:r>
               <w:rPr>
@@ -562,7 +620,7 @@
                 <w:noProof/>
                 <w:webHidden/>
               </w:rPr>
-              <w:instrText xml:space="preserve"> PAGEREF _Toc230364842 \h </w:instrText>
+              <w:instrText xml:space="preserve"> PAGEREF _Toc230683910 \h </w:instrText>
             </w:r>
             <w:r>
               <w:rPr>
@@ -582,7 +640,7 @@
                 <w:noProof/>
                 <w:webHidden/>
               </w:rPr>
-              <w:t>2</w:t>
+              <w:t>3</w:t>
             </w:r>
             <w:r>
               <w:rPr>
@@ -604,12 +662,66 @@
         </w:p>
       </w:sdtContent>
     </w:sdt>
+    <w:tbl>
+      <w:tblPr>
+        <w:tblW w:w="0" w:type="auto"/>
+        <w:tblLayout w:type="fixed"/>
+        <w:tblLook w:val="04A0" w:firstRow="1" w:lastRow="0" w:firstColumn="1" w:lastColumn="0" w:noHBand="0" w:noVBand="1"/>
+      </w:tblPr>
+      <w:tblGrid>
+        <w:gridCol w:w="9360"/>
+      </w:tblGrid>
+      <w:tr>
+        <w:tc>
+          <w:tcPr>
+            <w:tcW w:w="9360" w:type="dxa"/>
+            <w:shd w:val="clear" w:color="auto" w:fill="F4F6F9"/>
+          </w:tcPr>
+          <w:p>
+            <w:pPr>
+              <w:spacing w:after="0"/>
+            </w:pPr>
+            <w:r>
+              <w:rPr>
+                <w:b/>
+              </w:rPr>
+              <w:t xml:space="preserve">Lényeg röviden: </w:t>
+            </w:r>
+            <w:r>
+              <w:t xml:space="preserve">A PDF-számlákat vagy az </w:t>
+            </w:r>
+            <w:r>
+              <w:rPr>
+                <w:i/>
+                <w:iCs/>
+              </w:rPr>
+              <w:t>ivren</w:t>
+            </w:r>
+            <w:r>
+              <w:t xml:space="preserve"> (invoce renamer szerviz)</w:t>
+            </w:r>
+            <w:r>
+              <w:t xml:space="preserve"> automatikus átnevező mappájába kell menteni, vagy papírszámla esetén kézzel, számlaszám szerinti fájlnévvel kell az iScala csatolási mappájába tenni.</w:t>
+            </w:r>
+          </w:p>
+        </w:tc>
+      </w:tr>
+    </w:tbl>
     <w:p>
       <w:pPr>
         <w:pStyle w:val="Heading1"/>
         <w:spacing w:before="120"/>
       </w:pPr>
-      <w:bookmarkStart w:id="3" w:name="_Toc230364836"/>
+    </w:p>
+    <w:p>
+      <w:pPr>
+        <w:pStyle w:val="Heading1"/>
+        <w:spacing w:before="120"/>
+      </w:pPr>
+      <w:bookmarkStart w:id="3" w:name="_Toc230683904"/>
+      <w:r>
+        <w:t xml:space="preserve">1. </w:t>
+      </w:r>
       <w:r>
         <w:t xml:space="preserve">Gyors </w:t>
       </w:r>
@@ -623,128 +735,262 @@
       <w:bookmarkEnd w:id="0"/>
       <w:bookmarkEnd w:id="3"/>
     </w:p>
-    <w:p>
-      <w:r>
-        <w:t>Hálózati mappák:</w:t>
-      </w:r>
-    </w:p>
-    <w:p>
-      <w:pPr>
-        <w:spacing w:before="240"/>
-        <w:ind w:left="708"/>
-        <w:jc w:val="both"/>
-        <w:rPr>
-          <w:rFonts w:ascii="Cascadia Mono" w:hAnsi="Cascadia Mono"/>
-          <w:sz w:val="28"/>
-          <w:szCs w:val="28"/>
-        </w:rPr>
-      </w:pPr>
-      <w:r>
-        <w:rPr>
-          <w:rFonts w:ascii="Cascadia Mono" w:hAnsi="Cascadia Mono"/>
-          <w:sz w:val="28"/>
-          <w:szCs w:val="28"/>
-        </w:rPr>
-        <w:t>\\</w:t>
-      </w:r>
-      <w:r>
-        <w:rPr>
-          <w:rFonts w:ascii="Cascadia Mono" w:hAnsi="Cascadia Mono"/>
-          <w:color w:val="7030A0"/>
-          <w:sz w:val="28"/>
-          <w:szCs w:val="28"/>
-        </w:rPr>
-        <w:t>termi</w:t>
-      </w:r>
-      <w:r>
-        <w:rPr>
-          <w:rFonts w:ascii="Cascadia Mono" w:hAnsi="Cascadia Mono"/>
-          <w:sz w:val="28"/>
-          <w:szCs w:val="28"/>
-        </w:rPr>
-        <w:t>\SzallitoiSzamlak_Atnevezeshez</w:t>
-      </w:r>
-    </w:p>
-    <w:p>
-      <w:pPr>
-        <w:spacing w:before="240"/>
-        <w:ind w:left="708"/>
-        <w:jc w:val="both"/>
-        <w:rPr>
-          <w:rFonts w:ascii="Cascadia Mono" w:hAnsi="Cascadia Mono"/>
-          <w:sz w:val="28"/>
-          <w:szCs w:val="28"/>
-        </w:rPr>
-      </w:pPr>
-      <w:r>
-        <w:rPr>
-          <w:rFonts w:ascii="Cascadia Mono" w:hAnsi="Cascadia Mono"/>
-          <w:sz w:val="28"/>
-          <w:szCs w:val="28"/>
-        </w:rPr>
-        <w:t>\\</w:t>
-      </w:r>
-      <w:r>
-        <w:rPr>
-          <w:rFonts w:ascii="Cascadia Mono" w:hAnsi="Cascadia Mono"/>
-          <w:color w:val="7030A0"/>
-          <w:sz w:val="28"/>
-          <w:szCs w:val="28"/>
-        </w:rPr>
-        <w:t>termi</w:t>
-      </w:r>
-      <w:r>
-        <w:rPr>
-          <w:rFonts w:ascii="Cascadia Mono" w:hAnsi="Cascadia Mono"/>
-          <w:sz w:val="28"/>
-          <w:szCs w:val="28"/>
-        </w:rPr>
-        <w:t>\nem_atnevezheto_szamlak</w:t>
-      </w:r>
-    </w:p>
-    <w:p>
-      <w:pPr>
-        <w:spacing w:before="240"/>
-        <w:ind w:left="708"/>
-        <w:rPr>
-          <w:rFonts w:ascii="Cascadia Mono" w:hAnsi="Cascadia Mono"/>
-          <w:sz w:val="28"/>
-          <w:szCs w:val="28"/>
-        </w:rPr>
-      </w:pPr>
-      <w:r>
-        <w:rPr>
-          <w:rFonts w:ascii="Cascadia Mono" w:hAnsi="Cascadia Mono"/>
-          <w:sz w:val="28"/>
-          <w:szCs w:val="28"/>
-        </w:rPr>
-        <w:t>\\</w:t>
-      </w:r>
-      <w:r>
-        <w:rPr>
-          <w:rFonts w:ascii="Cascadia Mono" w:hAnsi="Cascadia Mono"/>
-          <w:color w:val="7030A0"/>
-          <w:sz w:val="28"/>
-          <w:szCs w:val="28"/>
-        </w:rPr>
-        <w:t>pdf-bejovo</w:t>
-      </w:r>
-      <w:r>
-        <w:rPr>
-          <w:rFonts w:ascii="Cascadia Mono" w:hAnsi="Cascadia Mono"/>
-          <w:sz w:val="28"/>
-          <w:szCs w:val="28"/>
-        </w:rPr>
-        <w:t>\SzallitoiSzamlak</w:t>
-      </w:r>
-    </w:p>
+    <w:tbl>
+      <w:tblPr>
+        <w:tblStyle w:val="TableGrid"/>
+        <w:tblW w:w="9527" w:type="dxa"/>
+        <w:tblBorders>
+          <w:top w:val="single" w:sz="4" w:space="0" w:color="BFBFBF" w:themeColor="background1" w:themeShade="BF"/>
+          <w:left w:val="single" w:sz="4" w:space="0" w:color="BFBFBF" w:themeColor="background1" w:themeShade="BF"/>
+          <w:bottom w:val="single" w:sz="4" w:space="0" w:color="BFBFBF" w:themeColor="background1" w:themeShade="BF"/>
+          <w:right w:val="single" w:sz="4" w:space="0" w:color="BFBFBF" w:themeColor="background1" w:themeShade="BF"/>
+          <w:insideH w:val="single" w:sz="4" w:space="0" w:color="BFBFBF" w:themeColor="background1" w:themeShade="BF"/>
+          <w:insideV w:val="single" w:sz="4" w:space="0" w:color="BFBFBF" w:themeColor="background1" w:themeShade="BF"/>
+        </w:tblBorders>
+        <w:tblLayout w:type="fixed"/>
+        <w:tblLook w:val="04A0" w:firstRow="1" w:lastRow="0" w:firstColumn="1" w:lastColumn="0" w:noHBand="0" w:noVBand="1"/>
+      </w:tblPr>
+      <w:tblGrid>
+        <w:gridCol w:w="5035"/>
+        <w:gridCol w:w="4492"/>
+      </w:tblGrid>
+      <w:tr>
+        <w:trPr>
+          <w:trHeight w:val="272"/>
+        </w:trPr>
+        <w:tc>
+          <w:tcPr>
+            <w:tcW w:w="5035" w:type="dxa"/>
+            <w:shd w:val="clear" w:color="auto" w:fill="E8EEF5"/>
+            <w:vAlign w:val="center"/>
+          </w:tcPr>
+          <w:p>
+            <w:pPr>
+              <w:rPr>
+                <w:lang w:val="hu-HU"/>
+              </w:rPr>
+            </w:pPr>
+            <w:r>
+              <w:rPr>
+                <w:b/>
+                <w:lang w:val="hu-HU"/>
+              </w:rPr>
+              <w:t>Mappa</w:t>
+            </w:r>
+          </w:p>
+        </w:tc>
+        <w:tc>
+          <w:tcPr>
+            <w:tcW w:w="4492" w:type="dxa"/>
+            <w:shd w:val="clear" w:color="auto" w:fill="E8EEF5"/>
+            <w:vAlign w:val="center"/>
+          </w:tcPr>
+          <w:p>
+            <w:pPr>
+              <w:rPr>
+                <w:lang w:val="hu-HU"/>
+              </w:rPr>
+            </w:pPr>
+            <w:r>
+              <w:rPr>
+                <w:b/>
+                <w:lang w:val="hu-HU"/>
+              </w:rPr>
+              <w:t>Mire való?</w:t>
+            </w:r>
+          </w:p>
+        </w:tc>
+      </w:tr>
+      <w:tr>
+        <w:trPr>
+          <w:trHeight w:val="805"/>
+        </w:trPr>
+        <w:tc>
+          <w:tcPr>
+            <w:tcW w:w="5035" w:type="dxa"/>
+            <w:vAlign w:val="center"/>
+          </w:tcPr>
+          <w:p>
+            <w:pPr>
+              <w:rPr>
+                <w:rFonts w:ascii="Cascadia Mono" w:hAnsi="Cascadia Mono" w:cs="Cascadia Mono"/>
+                <w:lang w:val="hu-HU"/>
+              </w:rPr>
+            </w:pPr>
+            <w:r>
+              <w:rPr>
+                <w:rFonts w:ascii="Cascadia Mono" w:hAnsi="Cascadia Mono" w:cs="Cascadia Mono"/>
+                <w:lang w:val="hu-HU"/>
+              </w:rPr>
+              <w:t>\\termi\SzallitoiSzamlak_Atnevezeshez</w:t>
+            </w:r>
+          </w:p>
+        </w:tc>
+        <w:tc>
+          <w:tcPr>
+            <w:tcW w:w="4492" w:type="dxa"/>
+            <w:vAlign w:val="center"/>
+          </w:tcPr>
+          <w:p>
+            <w:pPr>
+              <w:spacing w:line="276" w:lineRule="auto"/>
+              <w:rPr>
+                <w:lang w:val="hu-HU"/>
+              </w:rPr>
+            </w:pPr>
+            <w:r>
+              <w:rPr>
+                <w:lang w:val="hu-HU"/>
+              </w:rPr>
+              <w:t xml:space="preserve">Ide kerülnek az e-mailből vagy linkről letöltött PDF-számlák. Az </w:t>
+            </w:r>
+            <w:r>
+              <w:rPr>
+                <w:i/>
+                <w:iCs/>
+                <w:lang w:val="hu-HU"/>
+              </w:rPr>
+              <w:t>ivren</w:t>
+            </w:r>
+            <w:r>
+              <w:rPr>
+                <w:lang w:val="hu-HU"/>
+              </w:rPr>
+              <w:t xml:space="preserve"> innen próbálja automatikusan felismerni és átnevezni őket.</w:t>
+            </w:r>
+          </w:p>
+        </w:tc>
+      </w:tr>
+      <w:tr>
+        <w:trPr>
+          <w:trHeight w:val="531"/>
+        </w:trPr>
+        <w:tc>
+          <w:tcPr>
+            <w:tcW w:w="5035" w:type="dxa"/>
+            <w:vAlign w:val="center"/>
+          </w:tcPr>
+          <w:p>
+            <w:pPr>
+              <w:rPr>
+                <w:rFonts w:ascii="Cascadia Mono" w:hAnsi="Cascadia Mono" w:cs="Cascadia Mono"/>
+                <w:lang w:val="hu-HU"/>
+              </w:rPr>
+            </w:pPr>
+            <w:r>
+              <w:rPr>
+                <w:rFonts w:ascii="Cascadia Mono" w:hAnsi="Cascadia Mono" w:cs="Cascadia Mono"/>
+                <w:lang w:val="hu-HU"/>
+              </w:rPr>
+              <w:t>\\termi\nem_atnevezheto_szamlak</w:t>
+            </w:r>
+          </w:p>
+        </w:tc>
+        <w:tc>
+          <w:tcPr>
+            <w:tcW w:w="4492" w:type="dxa"/>
+            <w:vAlign w:val="center"/>
+          </w:tcPr>
+          <w:p>
+            <w:pPr>
+              <w:rPr>
+                <w:lang w:val="hu-HU"/>
+              </w:rPr>
+            </w:pPr>
+            <w:r>
+              <w:rPr>
+                <w:lang w:val="hu-HU"/>
+              </w:rPr>
+              <w:t xml:space="preserve">Ide kerülnek azok a PDF-ek, amelyeknél az </w:t>
+            </w:r>
+            <w:r>
+              <w:rPr>
+                <w:i/>
+                <w:iCs/>
+                <w:lang w:val="hu-HU"/>
+              </w:rPr>
+              <w:t>ivren</w:t>
+            </w:r>
+            <w:r>
+              <w:rPr>
+                <w:lang w:val="hu-HU"/>
+              </w:rPr>
+              <w:t xml:space="preserve"> nem tudta megállapítani a számlaszámot. Ezeket kézzel kell javítani.</w:t>
+            </w:r>
+          </w:p>
+        </w:tc>
+      </w:tr>
+      <w:tr>
+        <w:trPr>
+          <w:trHeight w:val="531"/>
+        </w:trPr>
+        <w:tc>
+          <w:tcPr>
+            <w:tcW w:w="5035" w:type="dxa"/>
+            <w:vAlign w:val="center"/>
+          </w:tcPr>
+          <w:p>
+            <w:pPr>
+              <w:rPr>
+                <w:rFonts w:ascii="Cascadia Mono" w:hAnsi="Cascadia Mono" w:cs="Cascadia Mono"/>
+                <w:lang w:val="hu-HU"/>
+              </w:rPr>
+            </w:pPr>
+            <w:r>
+              <w:rPr>
+                <w:rFonts w:ascii="Cascadia Mono" w:hAnsi="Cascadia Mono" w:cs="Cascadia Mono"/>
+                <w:lang w:val="hu-HU"/>
+              </w:rPr>
+              <w:t>\\pdf-bejovo\SzallitoiSzamlak</w:t>
+            </w:r>
+          </w:p>
+        </w:tc>
+        <w:tc>
+          <w:tcPr>
+            <w:tcW w:w="4492" w:type="dxa"/>
+            <w:vAlign w:val="center"/>
+          </w:tcPr>
+          <w:p>
+            <w:pPr>
+              <w:rPr>
+                <w:lang w:val="hu-HU"/>
+              </w:rPr>
+            </w:pPr>
+            <w:r>
+              <w:rPr>
+                <w:lang w:val="hu-HU"/>
+              </w:rPr>
+              <w:t xml:space="preserve">Ez az iScala csatolási mappája. Az </w:t>
+            </w:r>
+            <w:r>
+              <w:rPr>
+                <w:i/>
+                <w:iCs/>
+                <w:lang w:val="hu-HU"/>
+              </w:rPr>
+              <w:t>iScala</w:t>
+            </w:r>
+            <w:r>
+              <w:rPr>
+                <w:lang w:val="hu-HU"/>
+              </w:rPr>
+              <w:t xml:space="preserve"> innen olvassa be és csatolja a számlaképeket.</w:t>
+            </w:r>
+          </w:p>
+        </w:tc>
+      </w:tr>
+    </w:tbl>
+    <w:p/>
     <w:p>
       <w:pPr>
         <w:pStyle w:val="Heading1"/>
       </w:pPr>
       <w:bookmarkStart w:id="4" w:name="_Toc230364302"/>
       <w:bookmarkStart w:id="5" w:name="_Toc230364357"/>
-      <w:bookmarkStart w:id="6" w:name="_Toc230364837"/>
+      <w:bookmarkStart w:id="6" w:name="_Toc230683905"/>
+      <w:r>
+        <w:t xml:space="preserve">2. </w:t>
+      </w:r>
       <w:r>
         <w:t>Bej</w:t>
       </w:r>
@@ -813,12 +1059,13 @@
       <w:bookmarkStart w:id="7" w:name="_Toc230353464"/>
       <w:bookmarkStart w:id="8" w:name="_Toc230364303"/>
       <w:bookmarkStart w:id="9" w:name="_Toc230364358"/>
-      <w:bookmarkStart w:id="10" w:name="_Toc230364838"/>
-      <w:r>
-        <w:t>E</w:t>
-      </w:r>
-      <w:r>
-        <w:t>-mailben PDF-fájlként csatolva</w:t>
+      <w:bookmarkStart w:id="10" w:name="_Toc230683906"/>
+      <w:r>
+        <w:lastRenderedPageBreak/>
+        <w:t xml:space="preserve">2.1. </w:t>
+      </w:r>
+      <w:r>
+        <w:t>E-mailben PDF-fájlként csatolva</w:t>
       </w:r>
       <w:bookmarkEnd w:id="7"/>
       <w:bookmarkEnd w:id="8"/>
@@ -827,29 +1074,21 @@
     </w:p>
     <w:p>
       <w:r>
-        <w:t xml:space="preserve">A számla, mint PDF-fájl, az e-mailbe van ágyazva, onnan le kell tölteni az alábbi hálózati </w:t>
-      </w:r>
-      <w:r>
-        <w:t xml:space="preserve">útvonalon </w:t>
-      </w:r>
-      <w:r>
-        <w:t xml:space="preserve">található, </w:t>
-      </w:r>
-      <w:r>
-        <w:t>az adott cég almappájába</w:t>
-      </w:r>
-      <w:r>
-        <w:t>:</w:t>
+        <w:t xml:space="preserve">A számla, mint PDF-fájl, az e-mailbe van ágyazva, onnan le kell </w:t>
+      </w:r>
+      <w:r>
+        <w:t xml:space="preserve">menteni. A mentés helye az ivren átnevezési </w:t>
+      </w:r>
+      <w:r>
+        <w:t>mappája</w:t>
+      </w:r>
+      <w:r>
+        <w:t xml:space="preserve"> legyen:</w:t>
       </w:r>
     </w:p>
     <w:p>
       <w:pPr>
         <w:ind w:left="708"/>
-        <w:rPr>
-          <w:rFonts w:ascii="Cascadia Mono" w:hAnsi="Cascadia Mono"/>
-          <w:sz w:val="28"/>
-          <w:szCs w:val="28"/>
-        </w:rPr>
       </w:pPr>
       <w:r>
         <w:rPr>
@@ -878,6 +1117,17 @@
       </w:r>
     </w:p>
     <w:p>
+      <w:r>
+        <w:t>azon bel</w:t>
+      </w:r>
+      <w:r>
+        <w:t>ü</w:t>
+      </w:r>
+      <w:r>
+        <w:t>l az adott céghez tartozó almappa, akihez a számla tartozik.</w:t>
+      </w:r>
+    </w:p>
+    <w:p>
       <w:pPr>
         <w:rPr>
           <w:i/>
@@ -897,14 +1147,31 @@
       </w:r>
     </w:p>
     <w:p>
+      <w:r>
+        <w:t>A fájlnevet nem szükséges kézzel javítani: az ivren megpróbálja automatikusan felismerni a számlaszámot és átnevezni a PDF-et.</w:t>
+      </w:r>
+    </w:p>
+    <w:p>
       <w:pPr>
         <w:pStyle w:val="Heading2"/>
       </w:pPr>
       <w:bookmarkStart w:id="11" w:name="_Toc230364304"/>
       <w:bookmarkStart w:id="12" w:name="_Toc230364359"/>
-      <w:bookmarkStart w:id="13" w:name="_Toc230364839"/>
-      <w:r>
-        <w:t>E-mailben link a letöltési helyre hivatkozva</w:t>
+      <w:bookmarkStart w:id="13" w:name="_Toc230683907"/>
+      <w:r>
+        <w:t xml:space="preserve">2.2. </w:t>
+      </w:r>
+      <w:r>
+        <w:t xml:space="preserve">E-mailben </w:t>
+      </w:r>
+      <w:r>
+        <w:t xml:space="preserve">csak letöltési </w:t>
+      </w:r>
+      <w:r>
+        <w:t>link</w:t>
+      </w:r>
+      <w:r>
+        <w:t xml:space="preserve"> van</w:t>
       </w:r>
       <w:bookmarkEnd w:id="11"/>
       <w:bookmarkEnd w:id="12"/>
@@ -912,17 +1179,7 @@
     </w:p>
     <w:p>
       <w:r>
-        <w:t xml:space="preserve">A számla egy </w:t>
-      </w:r>
-      <w:r>
-        <w:rPr>
-          <w:b/>
-          <w:bCs/>
-        </w:rPr>
-        <w:t>linket tartalmaz</w:t>
-      </w:r>
-      <w:r>
-        <w:t xml:space="preserve"> ahhoz az helyhez (weblap), ahonnan a PDF-számlát le lehet tölteni.</w:t>
+        <w:t>Meg kell nyitni a linket (előtte meggyőződni, hogy nem gyanús-e, ahova mutat), és le kell tölteni a PDF-számlát.</w:t>
       </w:r>
     </w:p>
     <w:p>
@@ -933,7 +1190,13 @@
         <w:t>ö</w:t>
       </w:r>
       <w:r>
-        <w:t>ltéskor a mentés helyének az előbbi pontban bemutatott mappát kell megadni.</w:t>
+        <w:t>ltéskor a mentés helyének az előbbi pontban</w:t>
+      </w:r>
+      <w:r>
+        <w:t xml:space="preserve"> (2.1)</w:t>
+      </w:r>
+      <w:r>
+        <w:t xml:space="preserve"> bemutatott mappát kell megadni.</w:t>
       </w:r>
     </w:p>
     <w:p>
@@ -952,8 +1215,20 @@
           <w:sz w:val="18"/>
           <w:szCs w:val="18"/>
         </w:rPr>
-        <w:lastRenderedPageBreak/>
         <w:t>Ezt a letöltést jelenleg kézzel kell elvégezni; folyamatban van egy szervizprogram fejlesztése, amely a kézi letöltés kiváltja.</w:t>
+      </w:r>
+    </w:p>
+    <w:p>
+      <w:pPr>
+        <w:rPr>
+          <w:i/>
+          <w:iCs/>
+          <w:sz w:val="18"/>
+          <w:szCs w:val="18"/>
+        </w:rPr>
+      </w:pPr>
+      <w:r>
+        <w:t>A fájlnevet nem szükséges kézzel javítani: az ivren megpróbálja automatikusan felismerni a számlaszámot és átnevezni a PDF-et.</w:t>
       </w:r>
     </w:p>
     <w:p>
@@ -962,9 +1237,15 @@
       </w:pPr>
       <w:bookmarkStart w:id="14" w:name="_Toc230364305"/>
       <w:bookmarkStart w:id="15" w:name="_Toc230364360"/>
-      <w:bookmarkStart w:id="16" w:name="_Toc230364840"/>
-      <w:r>
-        <w:t>Postai úton papír alapon</w:t>
+      <w:bookmarkStart w:id="16" w:name="_Toc230683908"/>
+      <w:r>
+        <w:t xml:space="preserve">2.3. </w:t>
+      </w:r>
+      <w:r>
+        <w:t>A</w:t>
+      </w:r>
+      <w:r>
+        <w:t xml:space="preserve"> számla papíron, postán érkezik</w:t>
       </w:r>
       <w:bookmarkEnd w:id="14"/>
       <w:bookmarkEnd w:id="15"/>
@@ -972,13 +1253,29 @@
     </w:p>
     <w:p>
       <w:r>
-        <w:t>A beérkezett számlát (nyomtatványt) be kell szkennelni PDF-formátumban, fájlnévként a számlán szereplő sz</w:t>
+        <w:t>A beérkezett számlát (nyomtatványt) be kell szkennelni PDF-formátumban</w:t>
+      </w:r>
+      <w:r>
+        <w:t>.</w:t>
+      </w:r>
+    </w:p>
+    <w:p>
+      <w:r>
+        <w:t>F</w:t>
+      </w:r>
+      <w:r>
+        <w:t>ájlnévként a számlán szereplő sz</w:t>
       </w:r>
       <w:r>
         <w:t>á</w:t>
       </w:r>
       <w:r>
-        <w:t xml:space="preserve">mlaszámot kell megadni. Ha a számlaszám </w:t>
+        <w:t>mlaszámot kell megadni.</w:t>
+      </w:r>
+    </w:p>
+    <w:p>
+      <w:r>
+        <w:t xml:space="preserve">Ha a számlaszám </w:t>
       </w:r>
       <w:r>
         <w:t xml:space="preserve">olyan </w:t>
@@ -987,10 +1284,7 @@
         <w:t xml:space="preserve">karaktert tartalmaz, </w:t>
       </w:r>
       <w:r>
-        <w:t xml:space="preserve">amely </w:t>
-      </w:r>
-      <w:r>
-        <w:t>fájlnévben nem szerepeltethető</w:t>
+        <w:t>amely fájlnévben nem szerepeltethető</w:t>
       </w:r>
       <w:r>
         <w:t xml:space="preserve"> (</w:t>
@@ -1048,14 +1342,224 @@
         <w:t>.</w:t>
       </w:r>
     </w:p>
-    <w:p>
-      <w:pPr>
-        <w:keepNext/>
-      </w:pPr>
-      <w:r>
-        <w:t>Példák:</w:t>
-      </w:r>
-    </w:p>
+    <w:tbl>
+      <w:tblPr>
+        <w:tblStyle w:val="TableGrid"/>
+        <w:tblW w:w="9265" w:type="dxa"/>
+        <w:tblBorders>
+          <w:top w:val="single" w:sz="4" w:space="0" w:color="D9D9D9" w:themeColor="background1" w:themeShade="D9"/>
+          <w:left w:val="single" w:sz="4" w:space="0" w:color="D9D9D9" w:themeColor="background1" w:themeShade="D9"/>
+          <w:bottom w:val="single" w:sz="4" w:space="0" w:color="D9D9D9" w:themeColor="background1" w:themeShade="D9"/>
+          <w:right w:val="single" w:sz="4" w:space="0" w:color="D9D9D9" w:themeColor="background1" w:themeShade="D9"/>
+          <w:insideH w:val="single" w:sz="4" w:space="0" w:color="D9D9D9" w:themeColor="background1" w:themeShade="D9"/>
+          <w:insideV w:val="single" w:sz="4" w:space="0" w:color="D9D9D9" w:themeColor="background1" w:themeShade="D9"/>
+        </w:tblBorders>
+        <w:tblLayout w:type="fixed"/>
+        <w:tblLook w:val="04A0" w:firstRow="1" w:lastRow="0" w:firstColumn="1" w:lastColumn="0" w:noHBand="0" w:noVBand="1"/>
+      </w:tblPr>
+      <w:tblGrid>
+        <w:gridCol w:w="3120"/>
+        <w:gridCol w:w="3120"/>
+        <w:gridCol w:w="3025"/>
+      </w:tblGrid>
+      <w:tr>
+        <w:tc>
+          <w:tcPr>
+            <w:tcW w:w="3120" w:type="dxa"/>
+            <w:shd w:val="clear" w:color="auto" w:fill="E8EEF5"/>
+            <w:vAlign w:val="center"/>
+          </w:tcPr>
+          <w:p>
+            <w:pPr>
+              <w:rPr>
+                <w:lang w:val="hu-HU"/>
+              </w:rPr>
+            </w:pPr>
+            <w:r>
+              <w:rPr>
+                <w:b/>
+                <w:lang w:val="hu-HU"/>
+              </w:rPr>
+              <w:t>Számlaszám</w:t>
+            </w:r>
+          </w:p>
+        </w:tc>
+        <w:tc>
+          <w:tcPr>
+            <w:tcW w:w="3120" w:type="dxa"/>
+            <w:shd w:val="clear" w:color="auto" w:fill="E8EEF5"/>
+            <w:vAlign w:val="center"/>
+          </w:tcPr>
+          <w:p>
+            <w:pPr>
+              <w:rPr>
+                <w:lang w:val="hu-HU"/>
+              </w:rPr>
+            </w:pPr>
+            <w:r>
+              <w:rPr>
+                <w:b/>
+                <w:lang w:val="hu-HU"/>
+              </w:rPr>
+              <w:t>PDF</w:t>
+            </w:r>
+            <w:r>
+              <w:rPr>
+                <w:b/>
+                <w:lang w:val="hu-HU"/>
+              </w:rPr>
+              <w:t>-</w:t>
+            </w:r>
+            <w:r>
+              <w:rPr>
+                <w:b/>
+                <w:lang w:val="hu-HU"/>
+              </w:rPr>
+              <w:t>fájlnév</w:t>
+            </w:r>
+          </w:p>
+        </w:tc>
+        <w:tc>
+          <w:tcPr>
+            <w:tcW w:w="3025" w:type="dxa"/>
+            <w:shd w:val="clear" w:color="auto" w:fill="E8EEF5"/>
+            <w:vAlign w:val="center"/>
+          </w:tcPr>
+          <w:p>
+            <w:pPr>
+              <w:rPr>
+                <w:lang w:val="hu-HU"/>
+              </w:rPr>
+            </w:pPr>
+            <w:r>
+              <w:rPr>
+                <w:b/>
+                <w:lang w:val="hu-HU"/>
+              </w:rPr>
+              <w:t>Megjegyzés</w:t>
+            </w:r>
+          </w:p>
+        </w:tc>
+      </w:tr>
+      <w:tr>
+        <w:tc>
+          <w:tcPr>
+            <w:tcW w:w="3120" w:type="dxa"/>
+            <w:vAlign w:val="center"/>
+          </w:tcPr>
+          <w:p>
+            <w:pPr>
+              <w:rPr>
+                <w:lang w:val="hu-HU"/>
+              </w:rPr>
+            </w:pPr>
+            <w:r>
+              <w:rPr>
+                <w:lang w:val="hu-HU"/>
+              </w:rPr>
+              <w:t>2026/01234</w:t>
+            </w:r>
+          </w:p>
+        </w:tc>
+        <w:tc>
+          <w:tcPr>
+            <w:tcW w:w="3120" w:type="dxa"/>
+            <w:vAlign w:val="center"/>
+          </w:tcPr>
+          <w:p>
+            <w:pPr>
+              <w:rPr>
+                <w:lang w:val="hu-HU"/>
+              </w:rPr>
+            </w:pPr>
+            <w:r>
+              <w:rPr>
+                <w:lang w:val="hu-HU"/>
+              </w:rPr>
+              <w:t>2026~01234.pdf</w:t>
+            </w:r>
+          </w:p>
+        </w:tc>
+        <w:tc>
+          <w:tcPr>
+            <w:tcW w:w="3025" w:type="dxa"/>
+            <w:vAlign w:val="center"/>
+          </w:tcPr>
+          <w:p>
+            <w:pPr>
+              <w:rPr>
+                <w:lang w:val="hu-HU"/>
+              </w:rPr>
+            </w:pPr>
+            <w:r>
+              <w:rPr>
+                <w:lang w:val="hu-HU"/>
+              </w:rPr>
+              <w:t>A / jel nem használható fájlnévben, ezért ~ kerül a helyére.</w:t>
+            </w:r>
+          </w:p>
+        </w:tc>
+      </w:tr>
+      <w:tr>
+        <w:tc>
+          <w:tcPr>
+            <w:tcW w:w="3120" w:type="dxa"/>
+            <w:vAlign w:val="center"/>
+          </w:tcPr>
+          <w:p>
+            <w:pPr>
+              <w:rPr>
+                <w:lang w:val="hu-HU"/>
+              </w:rPr>
+            </w:pPr>
+            <w:r>
+              <w:rPr>
+                <w:lang w:val="hu-HU"/>
+              </w:rPr>
+              <w:t>2026_01234</w:t>
+            </w:r>
+          </w:p>
+        </w:tc>
+        <w:tc>
+          <w:tcPr>
+            <w:tcW w:w="3120" w:type="dxa"/>
+            <w:vAlign w:val="center"/>
+          </w:tcPr>
+          <w:p>
+            <w:pPr>
+              <w:rPr>
+                <w:lang w:val="hu-HU"/>
+              </w:rPr>
+            </w:pPr>
+            <w:r>
+              <w:rPr>
+                <w:lang w:val="hu-HU"/>
+              </w:rPr>
+              <w:t>2026_01234.pdf</w:t>
+            </w:r>
+          </w:p>
+        </w:tc>
+        <w:tc>
+          <w:tcPr>
+            <w:tcW w:w="3025" w:type="dxa"/>
+            <w:vAlign w:val="center"/>
+          </w:tcPr>
+          <w:p>
+            <w:pPr>
+              <w:rPr>
+                <w:lang w:val="hu-HU"/>
+              </w:rPr>
+            </w:pPr>
+            <w:r>
+              <w:rPr>
+                <w:lang w:val="hu-HU"/>
+              </w:rPr>
+              <w:t>Az aláhúzásjel használható, ezért változatlanul marad.</w:t>
+            </w:r>
+          </w:p>
+        </w:tc>
+      </w:tr>
+    </w:tbl>
     <w:p>
       <w:pPr>
         <w:tabs>
@@ -1063,224 +1567,6 @@
         </w:tabs>
         <w:ind w:left="270"/>
       </w:pPr>
-      <w:r>
-        <w:rPr>
-          <w:rFonts w:ascii="Cascadia Mono" w:hAnsi="Cascadia Mono"/>
-          <w:sz w:val="28"/>
-          <w:szCs w:val="28"/>
-        </w:rPr>
-        <w:t>2026/01234</w:t>
-      </w:r>
-      <w:r>
-        <w:rPr>
-          <w:rFonts w:ascii="Cascadia Mono" w:hAnsi="Cascadia Mono"/>
-          <w:sz w:val="16"/>
-          <w:szCs w:val="16"/>
-        </w:rPr>
-        <w:t xml:space="preserve"> </w:t>
-      </w:r>
-      <w:r>
-        <w:rPr>
-          <w:rFonts w:ascii="Cascadia Mono" w:hAnsi="Cascadia Mono"/>
-          <w:noProof/>
-          <w:sz w:val="28"/>
-          <w:szCs w:val="28"/>
-        </w:rPr>
-        <w:drawing>
-          <wp:inline distT="0" distB="0" distL="0" distR="0" wp14:anchorId="2B1C934D" wp14:editId="2512119A">
-            <wp:extent cx="419100" cy="157163"/>
-            <wp:effectExtent l="0" t="0" r="0" b="0"/>
-            <wp:docPr id="1601692251" name="Graphic 1" descr="Arrow Right with solid fill"/>
-            <wp:cNvGraphicFramePr>
-              <a:graphicFrameLocks xmlns:a="http://schemas.openxmlformats.org/drawingml/2006/main" noChangeAspect="1"/>
-            </wp:cNvGraphicFramePr>
-            <a:graphic xmlns:a="http://schemas.openxmlformats.org/drawingml/2006/main">
-              <a:graphicData uri="http://schemas.openxmlformats.org/drawingml/2006/picture">
-                <pic:pic xmlns:pic="http://schemas.openxmlformats.org/drawingml/2006/picture">
-                  <pic:nvPicPr>
-                    <pic:cNvPr id="1601692251" name="Graphic 1601692251" descr="Arrow Right with solid fill"/>
-                    <pic:cNvPicPr/>
-                  </pic:nvPicPr>
-                  <pic:blipFill>
-                    <a:blip r:embed="rId8">
-                      <a:extLst>
-                        <a:ext uri="{96DAC541-7B7A-43D3-8B79-37D633B846F1}">
-                          <asvg:svgBlip xmlns:asvg="http://schemas.microsoft.com/office/drawing/2016/SVG/main" r:embed="rId9"/>
-                        </a:ext>
-                      </a:extLst>
-                    </a:blip>
-                    <a:stretch>
-                      <a:fillRect/>
-                    </a:stretch>
-                  </pic:blipFill>
-                  <pic:spPr>
-                    <a:xfrm>
-                      <a:off x="0" y="0"/>
-                      <a:ext cx="430232" cy="161337"/>
-                    </a:xfrm>
-                    <a:prstGeom prst="rect">
-                      <a:avLst/>
-                    </a:prstGeom>
-                  </pic:spPr>
-                </pic:pic>
-              </a:graphicData>
-            </a:graphic>
-          </wp:inline>
-        </w:drawing>
-      </w:r>
-      <w:r>
-        <w:rPr>
-          <w:rFonts w:ascii="Cascadia Mono" w:hAnsi="Cascadia Mono"/>
-          <w:sz w:val="16"/>
-          <w:szCs w:val="16"/>
-        </w:rPr>
-        <w:t xml:space="preserve"> </w:t>
-      </w:r>
-      <w:r>
-        <w:rPr>
-          <w:rFonts w:ascii="Cascadia Mono" w:hAnsi="Cascadia Mono"/>
-          <w:sz w:val="28"/>
-          <w:szCs w:val="28"/>
-        </w:rPr>
-        <w:t>2026~01234.pdf</w:t>
-      </w:r>
-      <w:r>
-        <w:t xml:space="preserve"> </w:t>
-      </w:r>
-      <w:r>
-        <w:tab/>
-      </w:r>
-      <w:r>
-        <w:t>A ‘/’ nem szerepelhet fájlnévben.</w:t>
-      </w:r>
-    </w:p>
-    <w:p>
-      <w:pPr>
-        <w:tabs>
-          <w:tab w:val="left" w:pos="5400"/>
-        </w:tabs>
-        <w:ind w:left="270"/>
-      </w:pPr>
-      <w:r>
-        <w:rPr>
-          <w:rFonts w:ascii="Cascadia Mono" w:hAnsi="Cascadia Mono"/>
-          <w:sz w:val="28"/>
-          <w:szCs w:val="28"/>
-        </w:rPr>
-        <w:t>2026</w:t>
-      </w:r>
-      <w:r>
-        <w:rPr>
-          <w:rFonts w:ascii="Cascadia Mono" w:hAnsi="Cascadia Mono"/>
-          <w:sz w:val="28"/>
-          <w:szCs w:val="28"/>
-        </w:rPr>
-        <w:t>_</w:t>
-      </w:r>
-      <w:r>
-        <w:rPr>
-          <w:rFonts w:ascii="Cascadia Mono" w:hAnsi="Cascadia Mono"/>
-          <w:sz w:val="28"/>
-          <w:szCs w:val="28"/>
-        </w:rPr>
-        <w:t>01234</w:t>
-      </w:r>
-      <w:r>
-        <w:rPr>
-          <w:rFonts w:ascii="Cascadia Mono" w:hAnsi="Cascadia Mono"/>
-          <w:sz w:val="16"/>
-          <w:szCs w:val="16"/>
-        </w:rPr>
-        <w:t xml:space="preserve"> </w:t>
-      </w:r>
-      <w:r>
-        <w:rPr>
-          <w:rFonts w:ascii="Cascadia Mono" w:hAnsi="Cascadia Mono"/>
-          <w:noProof/>
-          <w:sz w:val="28"/>
-          <w:szCs w:val="28"/>
-        </w:rPr>
-        <w:drawing>
-          <wp:inline distT="0" distB="0" distL="0" distR="0" wp14:anchorId="73CD6480" wp14:editId="29956CAD">
-            <wp:extent cx="419100" cy="157163"/>
-            <wp:effectExtent l="0" t="0" r="0" b="0"/>
-            <wp:docPr id="2072878514" name="Graphic 1" descr="Arrow Right with solid fill"/>
-            <wp:cNvGraphicFramePr>
-              <a:graphicFrameLocks xmlns:a="http://schemas.openxmlformats.org/drawingml/2006/main" noChangeAspect="1"/>
-            </wp:cNvGraphicFramePr>
-            <a:graphic xmlns:a="http://schemas.openxmlformats.org/drawingml/2006/main">
-              <a:graphicData uri="http://schemas.openxmlformats.org/drawingml/2006/picture">
-                <pic:pic xmlns:pic="http://schemas.openxmlformats.org/drawingml/2006/picture">
-                  <pic:nvPicPr>
-                    <pic:cNvPr id="1601692251" name="Graphic 1601692251" descr="Arrow Right with solid fill"/>
-                    <pic:cNvPicPr/>
-                  </pic:nvPicPr>
-                  <pic:blipFill>
-                    <a:blip r:embed="rId8">
-                      <a:extLst>
-                        <a:ext uri="{96DAC541-7B7A-43D3-8B79-37D633B846F1}">
-                          <asvg:svgBlip xmlns:asvg="http://schemas.microsoft.com/office/drawing/2016/SVG/main" r:embed="rId9"/>
-                        </a:ext>
-                      </a:extLst>
-                    </a:blip>
-                    <a:stretch>
-                      <a:fillRect/>
-                    </a:stretch>
-                  </pic:blipFill>
-                  <pic:spPr>
-                    <a:xfrm>
-                      <a:off x="0" y="0"/>
-                      <a:ext cx="430232" cy="161337"/>
-                    </a:xfrm>
-                    <a:prstGeom prst="rect">
-                      <a:avLst/>
-                    </a:prstGeom>
-                  </pic:spPr>
-                </pic:pic>
-              </a:graphicData>
-            </a:graphic>
-          </wp:inline>
-        </w:drawing>
-      </w:r>
-      <w:r>
-        <w:rPr>
-          <w:rFonts w:ascii="Cascadia Mono" w:hAnsi="Cascadia Mono"/>
-          <w:sz w:val="16"/>
-          <w:szCs w:val="16"/>
-        </w:rPr>
-        <w:t xml:space="preserve"> </w:t>
-      </w:r>
-      <w:r>
-        <w:rPr>
-          <w:rFonts w:ascii="Cascadia Mono" w:hAnsi="Cascadia Mono"/>
-          <w:sz w:val="28"/>
-          <w:szCs w:val="28"/>
-        </w:rPr>
-        <w:t>2026</w:t>
-      </w:r>
-      <w:r>
-        <w:rPr>
-          <w:rFonts w:ascii="Cascadia Mono" w:hAnsi="Cascadia Mono"/>
-          <w:sz w:val="28"/>
-          <w:szCs w:val="28"/>
-        </w:rPr>
-        <w:t>_</w:t>
-      </w:r>
-      <w:r>
-        <w:rPr>
-          <w:rFonts w:ascii="Cascadia Mono" w:hAnsi="Cascadia Mono"/>
-          <w:sz w:val="28"/>
-          <w:szCs w:val="28"/>
-        </w:rPr>
-        <w:t>01234.pdf</w:t>
-      </w:r>
-      <w:r>
-        <w:t xml:space="preserve"> </w:t>
-      </w:r>
-      <w:r>
-        <w:tab/>
-        <w:t>Az eredeti számlaszámot kell megadni.</w:t>
-      </w:r>
     </w:p>
     <w:p>
       <w:r>
@@ -1299,16 +1585,16 @@
         <w:t>ni</w:t>
       </w:r>
       <w:r>
-        <w:t xml:space="preserve"> </w:t>
-      </w:r>
-      <w:r>
-        <w:t>az alábbi hálózati útvonalon</w:t>
-      </w:r>
-      <w:r>
-        <w:t xml:space="preserve"> található,</w:t>
-      </w:r>
-      <w:r>
-        <w:t xml:space="preserve"> az adott cég almappájába:</w:t>
+        <w:t xml:space="preserve"> az </w:t>
+      </w:r>
+      <w:r>
+        <w:t xml:space="preserve">iScala csatolási mappájába, </w:t>
+      </w:r>
+      <w:r>
+        <w:t>azon belül az adott céghez tartozó almappa, akihez a számla tartozik</w:t>
+      </w:r>
+      <w:r>
+        <w:t>:</w:t>
       </w:r>
     </w:p>
     <w:p>
@@ -1350,17 +1636,14 @@
       <w:pPr>
         <w:pStyle w:val="Heading1"/>
       </w:pPr>
-      <w:bookmarkStart w:id="17" w:name="_Toc230364306"/>
-      <w:bookmarkStart w:id="18" w:name="_Toc230364361"/>
-      <w:bookmarkStart w:id="19" w:name="_Toc230364841"/>
-      <w:r>
-        <w:t xml:space="preserve">Automatikus </w:t>
-      </w:r>
-      <w:r>
-        <w:t>PDF-</w:t>
-      </w:r>
-      <w:r>
-        <w:t>átnevezés</w:t>
+      <w:bookmarkStart w:id="17" w:name="_Toc230683909"/>
+      <w:r>
+        <w:t xml:space="preserve">3. </w:t>
+      </w:r>
+      <w:bookmarkStart w:id="18" w:name="_Toc230364306"/>
+      <w:bookmarkStart w:id="19" w:name="_Toc230364361"/>
+      <w:r>
+        <w:t>Mit csinál az ivren automatikusan</w:t>
       </w:r>
       <w:bookmarkEnd w:id="17"/>
       <w:bookmarkEnd w:id="18"/>
@@ -1373,7 +1656,10 @@
         </w:tabs>
       </w:pPr>
       <w:r>
-        <w:t xml:space="preserve">A </w:t>
+        <w:t>Az ivren figyeli a</w:t>
+      </w:r>
+      <w:r>
+        <w:t xml:space="preserve"> </w:t>
       </w:r>
       <w:r>
         <w:rPr>
@@ -1396,49 +1682,28 @@
         <w:t>a</w:t>
       </w:r>
       <w:r>
-        <w:t xml:space="preserve"> bemásolt PDF-fájlokat a Mega-Logistic saját szervizprogramja (</w:t>
-      </w:r>
-      <w:r>
-        <w:rPr>
-          <w:i/>
-          <w:iCs/>
-        </w:rPr>
-        <w:t>ivren</w:t>
-      </w:r>
-      <w:r>
-        <w:t xml:space="preserve"> – </w:t>
-      </w:r>
-      <w:r>
-        <w:rPr>
-          <w:sz w:val="18"/>
-          <w:szCs w:val="18"/>
-        </w:rPr>
-        <w:t>invoice renamer</w:t>
-      </w:r>
-      <w:r>
-        <w:t>) megpróbálja átnevezni</w:t>
-      </w:r>
-      <w:r>
-        <w:t>:</w:t>
-      </w:r>
-      <w:r>
         <w:t xml:space="preserve"> </w:t>
       </w:r>
       <w:r>
-        <w:t>a</w:t>
-      </w:r>
-      <w:r>
-        <w:t xml:space="preserve">z </w:t>
-      </w:r>
-      <w:r>
-        <w:rPr>
-          <w:i/>
-          <w:iCs/>
-        </w:rPr>
-        <w:t>ivren</w:t>
-      </w:r>
-      <w:r>
-        <w:t xml:space="preserve"> “belenéz” a PDF-fájlba, és elvégzi automatikusan az átnevezést</w:t>
+        <w:t xml:space="preserve">kerülő </w:t>
+      </w:r>
+      <w:r>
+        <w:t>PDF-fájlokat</w:t>
+      </w:r>
+      <w:r>
+        <w:t xml:space="preserve">. Megpróbálja </w:t>
+      </w:r>
+      <w:r>
+        <w:t xml:space="preserve">kiolvasni a számlaszámot a </w:t>
+      </w:r>
+      <w:r>
+        <w:t>PDF-fájlb</w:t>
+      </w:r>
+      <w:r>
+        <w:t>ól. Ha sikerül,</w:t>
+      </w:r>
+      <w:r>
+        <w:t xml:space="preserve"> elvégzi automatikusan az átnevezést</w:t>
       </w:r>
       <w:r>
         <w:t>,</w:t>
@@ -1461,7 +1726,16 @@
           <w:sz w:val="20"/>
           <w:szCs w:val="20"/>
         </w:rPr>
-        <w:t>\\pdf-bejovo\SzallitoiSzamlak</w:t>
+        <w:t>\\pdf-</w:t>
+      </w:r>
+      <w:r>
+        <w:rPr>
+          <w:rFonts w:ascii="Cascadia Mono" w:hAnsi="Cascadia Mono"/>
+          <w:sz w:val="20"/>
+          <w:szCs w:val="20"/>
+        </w:rPr>
+        <w:lastRenderedPageBreak/>
+        <w:t>bejovo\SzallitoiSzamlak</w:t>
       </w:r>
       <w:r>
         <w:rPr>
@@ -1511,10 +1785,16 @@
     </w:p>
     <w:p>
       <w:r>
-        <w:t xml:space="preserve">Az ide került számlákat kézzel kell átnevezni, majd pedig </w:t>
-      </w:r>
-      <w:r>
-        <w:t>át kell helyez az alábbi hálózati útvonalon az adott cég almappájába:</w:t>
+        <w:t xml:space="preserve">Az ide került számlákat kézzel kell </w:t>
+      </w:r>
+      <w:r>
+        <w:t xml:space="preserve">ellenőrizni és </w:t>
+      </w:r>
+      <w:r>
+        <w:t xml:space="preserve">átnevezni, majd pedig át kell helyez az </w:t>
+      </w:r>
+      <w:r>
+        <w:t>iScala csatolási mappájába:</w:t>
       </w:r>
     </w:p>
     <w:p>
@@ -1554,39 +1834,63 @@
     </w:p>
     <w:p>
       <w:pPr>
+        <w:rPr>
+          <w:rFonts w:ascii="Cascadia Mono" w:hAnsi="Cascadia Mono"/>
+          <w:sz w:val="28"/>
+          <w:szCs w:val="28"/>
+        </w:rPr>
+      </w:pPr>
+      <w:r>
+        <w:t>azon belül az adott céghez tartozó almappa, akihez a számla tartozik.</w:t>
+      </w:r>
+    </w:p>
+    <w:p>
+      <w:pPr>
         <w:pStyle w:val="Heading1"/>
       </w:pPr>
-      <w:bookmarkStart w:id="20" w:name="_Toc230364307"/>
-      <w:bookmarkStart w:id="21" w:name="_Toc230364362"/>
-      <w:bookmarkStart w:id="22" w:name="_Toc230364842"/>
+      <w:bookmarkStart w:id="20" w:name="_Toc230683910"/>
+      <w:r>
+        <w:t xml:space="preserve">4. </w:t>
+      </w:r>
+      <w:bookmarkStart w:id="21" w:name="_Toc230364307"/>
+      <w:bookmarkStart w:id="22" w:name="_Toc230364362"/>
+      <w:r>
+        <w:t xml:space="preserve">Mit csinál az </w:t>
+      </w:r>
       <w:r>
         <w:t>i</w:t>
       </w:r>
       <w:r>
-        <w:t>Scala program a</w:t>
-      </w:r>
-      <w:r>
-        <w:t>utomatikus</w:t>
-      </w:r>
-      <w:r>
-        <w:t>an csatol</w:t>
-      </w:r>
-      <w:bookmarkEnd w:id="20"/>
+        <w:t>Scala</w:t>
+      </w:r>
       <w:bookmarkEnd w:id="21"/>
       <w:bookmarkEnd w:id="22"/>
+      <w:r>
+        <w:t>?</w:t>
+      </w:r>
+      <w:bookmarkEnd w:id="20"/>
     </w:p>
     <w:p>
       <w:r>
         <w:t xml:space="preserve">Az iScala program minden esetben </w:t>
       </w:r>
       <w:r>
+        <w:t xml:space="preserve">automatikusan </w:t>
+      </w:r>
+      <w:r>
         <w:t xml:space="preserve">beolvassa </w:t>
       </w:r>
       <w:r>
         <w:t xml:space="preserve">az alábbi </w:t>
       </w:r>
       <w:r>
-        <w:t>hálózati mappába került fájlokat (1-5 másodperc idő elteltével):</w:t>
+        <w:t>hálózati mappába került fájlokat (</w:t>
+      </w:r>
+      <w:r>
+        <w:t>néhány</w:t>
+      </w:r>
+      <w:r>
+        <w:t xml:space="preserve"> másodperc idő elteltével):</w:t>
       </w:r>
     </w:p>
     <w:p>
@@ -1626,37 +1930,35 @@
     </w:p>
     <w:p>
       <w:r>
-        <w:t>Ha olyan fájlnévvel helyeztünk el ebbe a mappába egy PDF-fájlt, amely néven nincs egyik szállítóhoz sem számla az iScala adatbázisában, akkor is megtörténik a PDF-fájl beolvasása és a mappából történő eltávolítása. Az ilyen esetben a csatolás akkor fog megtörténni, amikor az adott számlaszámmal egy szállítóhoz rögzítésre kerül egy számla.</w:t>
-      </w:r>
-    </w:p>
-    <w:p>
-      <w:r>
-        <w:t>Ha már van egy adott néven (számlaszámmal) PDF-fájl beolvasva vagy csatolva, utána is tetszőleges alkalommal lehet ugyanolyan névvel (</w:t>
-      </w:r>
-      <w:r>
-        <w:t>számlaszámmal</w:t>
-      </w:r>
-      <w:r>
-        <w:t xml:space="preserve">) PDF-fájlokat betenni a fenti </w:t>
-      </w:r>
-      <w:r>
-        <w:lastRenderedPageBreak/>
-        <w:t>hálózati mappába, az iScala rendr</w:t>
-      </w:r>
-      <w:r>
-        <w:t>e</w:t>
-      </w:r>
-      <w:r>
-        <w:t xml:space="preserve"> be fogja olvasni illetve csatolni a PDF-fájlt. Ha valamelyik feleslegesen lett csatolva, akkor az iScala programban a csatolást törölhetjük:</w:t>
-      </w:r>
-    </w:p>
+        <w:t>A beolvasott fájl eltűnik a mappából, és bekerül az iScala adatbázisába.</w:t>
+      </w:r>
+    </w:p>
+    <w:p>
+      <w:r>
+        <w:t>Ha a fájlnévben szereplő számlaszámhoz még nincs rögzített számla az iScalában, a PDF akkor is eltűnhet a mappából. A csatolás akkor történik meg, amikor az adott számlaszámú számla rögzítésre kerül.</w:t>
+      </w:r>
+    </w:p>
+    <w:p>
+      <w:r>
+        <w:t>Ugyanazzal a számlaszámmal később is be lehet tenni újabb PDF-et; az iScala újra beolvassa és csatolja</w:t>
+      </w:r>
+      <w:r>
+        <w:t>.</w:t>
+      </w:r>
+    </w:p>
+    <w:p>
+      <w:r>
+        <w:t>Ha egy PDF feleslegesen lett csatolva, a csatolást az iScalában lehet törölni</w:t>
+      </w:r>
+      <w:r>
+        <w:t>:</w:t>
+      </w:r>
+    </w:p>
+    <w:p/>
     <w:p>
       <w:pPr>
         <w:jc w:val="center"/>
       </w:pPr>
-      <w:r>
-        <w:br/>
-      </w:r>
       <w:r>
         <w:rPr>
           <w:noProof/>
@@ -1679,7 +1981,7 @@
                     </pic:cNvPicPr>
                   </pic:nvPicPr>
                   <pic:blipFill>
-                    <a:blip r:embed="rId10">
+                    <a:blip r:embed="rId8">
                       <a:extLst>
                         <a:ext uri="{28A0092B-C50C-407E-A947-70E740481C1C}">
                           <a14:useLocalDpi xmlns:a14="http://schemas.microsoft.com/office/drawing/2010/main" val="0"/>
@@ -1712,11 +2014,9 @@
       </w:r>
     </w:p>
     <w:p/>
-    <w:p/>
-    <w:p/>
     <w:sectPr>
-      <w:headerReference w:type="default" r:id="rId11"/>
-      <w:footerReference w:type="default" r:id="rId12"/>
+      <w:headerReference w:type="default" r:id="rId9"/>
+      <w:footerReference w:type="default" r:id="rId10"/>
       <w:pgSz w:w="12240" w:h="15840" w:code="1"/>
       <w:pgMar w:top="1166" w:right="1440" w:bottom="1080" w:left="1440" w:header="720" w:footer="432" w:gutter="0"/>
       <w:cols w:space="720"/>
@@ -1823,27 +2123,41 @@
   <w:p>
     <w:pPr>
       <w:pStyle w:val="Header"/>
+      <w:rPr>
+        <w:color w:val="D9D9D9" w:themeColor="background1" w:themeShade="D9"/>
+      </w:rPr>
     </w:pPr>
     <w:r>
+      <w:rPr>
+        <w:color w:val="D9D9D9" w:themeColor="background1" w:themeShade="D9"/>
+      </w:rPr>
       <w:fldChar w:fldCharType="begin"/>
     </w:r>
     <w:r>
       <w:rPr>
+        <w:color w:val="D9D9D9" w:themeColor="background1" w:themeShade="D9"/>
         <w:lang w:val="en-US"/>
       </w:rPr>
       <w:instrText xml:space="preserve"> FILENAME \p \* MERGEFORMAT </w:instrText>
     </w:r>
     <w:r>
+      <w:rPr>
+        <w:color w:val="D9D9D9" w:themeColor="background1" w:themeShade="D9"/>
+      </w:rPr>
       <w:fldChar w:fldCharType="separate"/>
     </w:r>
     <w:r>
       <w:rPr>
         <w:noProof/>
+        <w:color w:val="D9D9D9" w:themeColor="background1" w:themeShade="D9"/>
         <w:lang w:val="en-US"/>
       </w:rPr>
       <w:t>C:\repo\ivren\docs\Scala\Számlaképfájlok csatolása - felhasználóknak.docx</w:t>
     </w:r>
     <w:r>
+      <w:rPr>
+        <w:color w:val="D9D9D9" w:themeColor="background1" w:themeShade="D9"/>
+      </w:rPr>
       <w:fldChar w:fldCharType="end"/>
     </w:r>
   </w:p>
@@ -2562,7 +2876,7 @@
     <w:lsdException w:name="Table Web 2" w:semiHidden="1" w:unhideWhenUsed="1"/>
     <w:lsdException w:name="Table Web 3" w:semiHidden="1" w:unhideWhenUsed="1"/>
     <w:lsdException w:name="Balloon Text" w:semiHidden="1" w:unhideWhenUsed="1"/>
-    <w:lsdException w:name="Table Grid" w:uiPriority="39"/>
+    <w:lsdException w:name="Table Grid" w:uiPriority="59"/>
     <w:lsdException w:name="Table Theme" w:semiHidden="1" w:unhideWhenUsed="1"/>
     <w:lsdException w:name="Placeholder Text" w:semiHidden="1"/>
     <w:lsdException w:name="No Spacing" w:uiPriority="1" w:qFormat="1"/>
@@ -3431,6 +3745,30 @@
       <w:lang w:eastAsia="hu-HU"/>
       <w14:ligatures w14:val="none"/>
     </w:rPr>
+  </w:style>
+  <w:style w:type="table" w:styleId="TableGrid">
+    <w:name w:val="Table Grid"/>
+    <w:basedOn w:val="TableNormal"/>
+    <w:uiPriority w:val="59"/>
+    <w:rsid w:val="007F61BE"/>
+    <w:pPr>
+      <w:spacing w:after="0" w:line="240" w:lineRule="auto"/>
+    </w:pPr>
+    <w:rPr>
+      <w:rFonts w:eastAsiaTheme="minorEastAsia"/>
+      <w:lang w:val="en-US"/>
+      <w14:ligatures w14:val="none"/>
+    </w:rPr>
+    <w:tblPr>
+      <w:tblBorders>
+        <w:top w:val="single" w:sz="4" w:space="0" w:color="auto"/>
+        <w:left w:val="single" w:sz="4" w:space="0" w:color="auto"/>
+        <w:bottom w:val="single" w:sz="4" w:space="0" w:color="auto"/>
+        <w:right w:val="single" w:sz="4" w:space="0" w:color="auto"/>
+        <w:insideH w:val="single" w:sz="4" w:space="0" w:color="auto"/>
+        <w:insideV w:val="single" w:sz="4" w:space="0" w:color="auto"/>
+      </w:tblBorders>
+    </w:tblPr>
   </w:style>
 </w:styles>
 </file>

</xml_diff>